<commit_message>
content(resume): merge Senior Software Developer into Software Developer
- Rebuild resume PDF/DOCX: one Software Developer role (May 2023 - Dec 2024)
  with combined cloud-lab + VPN/orchestration bullets, then Technical Lead
- Matches the portfolio Experience section and LinkedIn
</commit_message>
<xml_diff>
--- a/profile-assets/Bhadrinathan_A_Resume.docx
+++ b/profile-assets/Bhadrinathan_A_Resume.docx
@@ -464,7 +464,7 @@
           <w:sz w:val="21"/>
           <w:szCs w:val="21"/>
         </w:rPr>
-        <w:t xml:space="preserve">Senior Software Developer</w:t>
+        <w:t xml:space="preserve">Software Developer</w:t>
       </w:r>
       <w:r>
         <w:rPr>
@@ -481,26 +481,64 @@
           <w:sz w:val="19"/>
           <w:szCs w:val="19"/>
         </w:rPr>
-        <w:t xml:space="preserve">Mar 2024 – Dec 2024</w:t>
-      </w:r>
-    </w:p>
-    <w:p>
-      <w:pPr>
-        <w:pStyle w:val="ListParagraph"/>
-        <w:numPr>
-          <w:ilvl w:val="0"/>
-          <w:numId w:val="1"/>
-        </w:numPr>
-        <w:spacing w:after="6" w:line="230"/>
-      </w:pPr>
-      <w:r>
-        <w:rPr>
-          <w:rFonts w:ascii="Calibri" w:cs="Calibri" w:eastAsia="Calibri" w:hAnsi="Calibri"/>
-          <w:color w:val="333333"/>
-          <w:sz w:val="20"/>
-          <w:szCs w:val="20"/>
-        </w:rPr>
-        <w:t xml:space="preserve">Designed and implemented a secure WireGuard VPN layer for private network access to cloud lab environments, with per-session isolation and controlled resource access.</w:t>
+        <w:t xml:space="preserve">May 2023 – Dec 2024</w:t>
+      </w:r>
+    </w:p>
+    <w:p>
+      <w:pPr>
+        <w:pStyle w:val="ListParagraph"/>
+        <w:numPr>
+          <w:ilvl w:val="0"/>
+          <w:numId w:val="1"/>
+        </w:numPr>
+        <w:spacing w:after="6" w:line="230"/>
+      </w:pPr>
+      <w:r>
+        <w:rPr>
+          <w:rFonts w:ascii="Calibri" w:cs="Calibri" w:eastAsia="Calibri" w:hAnsi="Calibri"/>
+          <w:color w:val="333333"/>
+          <w:sz w:val="20"/>
+          <w:szCs w:val="20"/>
+        </w:rPr>
+        <w:t xml:space="preserve">Built a cloud labs platform that provisions isolated, browser-accessible development environments on demand, removing all local setup for users.</w:t>
+      </w:r>
+    </w:p>
+    <w:p>
+      <w:pPr>
+        <w:pStyle w:val="ListParagraph"/>
+        <w:numPr>
+          <w:ilvl w:val="0"/>
+          <w:numId w:val="1"/>
+        </w:numPr>
+        <w:spacing w:after="6" w:line="230"/>
+      </w:pPr>
+      <w:r>
+        <w:rPr>
+          <w:rFonts w:ascii="Calibri" w:cs="Calibri" w:eastAsia="Calibri" w:hAnsi="Calibri"/>
+          <w:color w:val="333333"/>
+          <w:sz w:val="20"/>
+          <w:szCs w:val="20"/>
+        </w:rPr>
+        <w:t xml:space="preserve">Developed the core full-stack product: user-facing frontend, backend APIs, and environment provisioning services, with containerized labs for consistent, reproducible sessions.</w:t>
+      </w:r>
+    </w:p>
+    <w:p>
+      <w:pPr>
+        <w:pStyle w:val="ListParagraph"/>
+        <w:numPr>
+          <w:ilvl w:val="0"/>
+          <w:numId w:val="1"/>
+        </w:numPr>
+        <w:spacing w:after="6" w:line="230"/>
+      </w:pPr>
+      <w:r>
+        <w:rPr>
+          <w:rFonts w:ascii="Calibri" w:cs="Calibri" w:eastAsia="Calibri" w:hAnsi="Calibri"/>
+          <w:color w:val="333333"/>
+          <w:sz w:val="20"/>
+          <w:szCs w:val="20"/>
+        </w:rPr>
+        <w:t xml:space="preserve">Designed and implemented a secure WireGuard VPN layer for private, per-session network access to lab environments, with controlled resource access and isolation.</w:t>
       </w:r>
     </w:p>
     <w:p>
@@ -538,100 +576,7 @@
           <w:sz w:val="20"/>
           <w:szCs w:val="20"/>
         </w:rPr>
-        <w:t xml:space="preserve">Drove code quality through reviews and architectural guidance across the platform.</w:t>
-      </w:r>
-    </w:p>
-    <w:p>
-      <w:pPr>
-        <w:tabs>
-          <w:tab w:val="right" w:pos="10440"/>
-        </w:tabs>
-        <w:spacing w:after="8" w:before="52"/>
-      </w:pPr>
-      <w:r>
-        <w:rPr>
-          <w:rFonts w:ascii="Calibri" w:cs="Calibri" w:eastAsia="Calibri" w:hAnsi="Calibri"/>
-          <w:b/>
-          <w:bCs/>
-          <w:color w:val="000000"/>
-          <w:sz w:val="21"/>
-          <w:szCs w:val="21"/>
-        </w:rPr>
-        <w:t xml:space="preserve">Software Developer</w:t>
-      </w:r>
-      <w:r>
-        <w:rPr>
-          <w:rFonts w:ascii="Calibri" w:cs="Calibri" w:eastAsia="Calibri" w:hAnsi="Calibri"/>
-          <w:sz w:val="19"/>
-          <w:szCs w:val="19"/>
-        </w:rPr>
-        <w:tab/>
-      </w:r>
-      <w:r>
-        <w:rPr>
-          <w:rFonts w:ascii="Calibri" w:cs="Calibri" w:eastAsia="Calibri" w:hAnsi="Calibri"/>
-          <w:color w:val="555555"/>
-          <w:sz w:val="19"/>
-          <w:szCs w:val="19"/>
-        </w:rPr>
-        <w:t xml:space="preserve">May 2023 – Feb 2024</w:t>
-      </w:r>
-    </w:p>
-    <w:p>
-      <w:pPr>
-        <w:pStyle w:val="ListParagraph"/>
-        <w:numPr>
-          <w:ilvl w:val="0"/>
-          <w:numId w:val="1"/>
-        </w:numPr>
-        <w:spacing w:after="6" w:line="230"/>
-      </w:pPr>
-      <w:r>
-        <w:rPr>
-          <w:rFonts w:ascii="Calibri" w:cs="Calibri" w:eastAsia="Calibri" w:hAnsi="Calibri"/>
-          <w:color w:val="333333"/>
-          <w:sz w:val="20"/>
-          <w:szCs w:val="20"/>
-        </w:rPr>
-        <w:t xml:space="preserve">Built a cloud labs platform that provisions isolated, browser-accessible development environments on demand, removing all local setup for users.</w:t>
-      </w:r>
-    </w:p>
-    <w:p>
-      <w:pPr>
-        <w:pStyle w:val="ListParagraph"/>
-        <w:numPr>
-          <w:ilvl w:val="0"/>
-          <w:numId w:val="1"/>
-        </w:numPr>
-        <w:spacing w:after="6" w:line="230"/>
-      </w:pPr>
-      <w:r>
-        <w:rPr>
-          <w:rFonts w:ascii="Calibri" w:cs="Calibri" w:eastAsia="Calibri" w:hAnsi="Calibri"/>
-          <w:color w:val="333333"/>
-          <w:sz w:val="20"/>
-          <w:szCs w:val="20"/>
-        </w:rPr>
-        <w:t xml:space="preserve">Developed the core full-stack product: user-facing frontend, backend APIs, and environment provisioning services.</w:t>
-      </w:r>
-    </w:p>
-    <w:p>
-      <w:pPr>
-        <w:pStyle w:val="ListParagraph"/>
-        <w:numPr>
-          <w:ilvl w:val="0"/>
-          <w:numId w:val="1"/>
-        </w:numPr>
-        <w:spacing w:after="6" w:line="230"/>
-      </w:pPr>
-      <w:r>
-        <w:rPr>
-          <w:rFonts w:ascii="Calibri" w:cs="Calibri" w:eastAsia="Calibri" w:hAnsi="Calibri"/>
-          <w:color w:val="333333"/>
-          <w:sz w:val="20"/>
-          <w:szCs w:val="20"/>
-        </w:rPr>
-        <w:t xml:space="preserve">Containerized lab environments to guarantee consistent, reproducible sessions.</w:t>
+        <w:t xml:space="preserve">Drove code quality and architectural direction through reviews and guidance across the platform.</w:t>
       </w:r>
     </w:p>
     <w:p>

</xml_diff>

<commit_message>
content(resume): restyle Open Source & Projects — distinct bold-named entries
- Each project (fastapi_sse_events, ZeroVPN, RAG Knowledge System, Docker Stats
  Monitor) now leads with a bold name instead of a flat bullet list that read
  like sub-points of fastapi-querybuilder; tightened wording
</commit_message>
<xml_diff>
--- a/profile-assets/Bhadrinathan_A_Resume.docx
+++ b/profile-assets/Bhadrinathan_A_Resume.docx
@@ -741,7 +741,7 @@
           <w:sz w:val="20"/>
           <w:szCs w:val="20"/>
         </w:rPr>
-        <w:t xml:space="preserve">Python package adding smart filtering, sorting, and searching to FastAPI + SQLAlchemy apps; 16,000+ PyPI downloads, 18 releases, MIT license.</w:t>
+        <w:t xml:space="preserve">Python package adding smart filtering, sorting, and searching to FastAPI + SQLAlchemy apps — 16,000+ PyPI downloads, 18 releases, MIT license.</w:t>
       </w:r>
     </w:p>
     <w:p>
@@ -775,49 +775,112 @@
       <w:r>
         <w:rPr>
           <w:rFonts w:ascii="Calibri" w:cs="Calibri" w:eastAsia="Calibri" w:hAnsi="Calibri"/>
-          <w:color w:val="333333"/>
-          <w:sz w:val="20"/>
-          <w:szCs w:val="20"/>
-        </w:rPr>
-        <w:t xml:space="preserve">fastapi_sse_events — author of a library that simplifies server-sent events for FastAPI applications.</w:t>
-      </w:r>
-    </w:p>
-    <w:p>
-      <w:pPr>
-        <w:pStyle w:val="ListParagraph"/>
-        <w:numPr>
-          <w:ilvl w:val="0"/>
-          <w:numId w:val="1"/>
-        </w:numPr>
-        <w:spacing w:after="6" w:line="230"/>
-      </w:pPr>
-      <w:r>
-        <w:rPr>
-          <w:rFonts w:ascii="Calibri" w:cs="Calibri" w:eastAsia="Calibri" w:hAnsi="Calibri"/>
-          <w:color w:val="333333"/>
-          <w:sz w:val="20"/>
-          <w:szCs w:val="20"/>
-        </w:rPr>
-        <w:t xml:space="preserve">RAG Knowledge System — Retrieval-Augmented Generation with pgvector semantic search, LangGraph agent orchestration, and an LLM evaluation harness.</w:t>
-      </w:r>
-    </w:p>
-    <w:p>
-      <w:pPr>
-        <w:pStyle w:val="ListParagraph"/>
-        <w:numPr>
-          <w:ilvl w:val="0"/>
-          <w:numId w:val="1"/>
-        </w:numPr>
-        <w:spacing w:after="6" w:line="230"/>
-      </w:pPr>
-      <w:r>
-        <w:rPr>
-          <w:rFonts w:ascii="Calibri" w:cs="Calibri" w:eastAsia="Calibri" w:hAnsi="Calibri"/>
-          <w:color w:val="333333"/>
-          <w:sz w:val="20"/>
-          <w:szCs w:val="20"/>
-        </w:rPr>
-        <w:t xml:space="preserve">Docker Stats Monitoring Tool — real-time web dashboard for container status, CPU/memory usage, and network/block I/O.</w:t>
+          <w:b/>
+          <w:bCs/>
+          <w:color w:val="333333"/>
+          <w:sz w:val="20"/>
+          <w:szCs w:val="20"/>
+        </w:rPr>
+        <w:t xml:space="preserve">fastapi_sse_events</w:t>
+      </w:r>
+      <w:r>
+        <w:rPr>
+          <w:rFonts w:ascii="Calibri" w:cs="Calibri" w:eastAsia="Calibri" w:hAnsi="Calibri"/>
+          <w:color w:val="333333"/>
+          <w:sz w:val="20"/>
+          <w:szCs w:val="20"/>
+        </w:rPr>
+        <w:t xml:space="preserve"> — published PyPI library that simplifies Server-Sent Events for FastAPI, backed by Redis pub/sub for horizontal scale.</w:t>
+      </w:r>
+    </w:p>
+    <w:p>
+      <w:pPr>
+        <w:pStyle w:val="ListParagraph"/>
+        <w:numPr>
+          <w:ilvl w:val="0"/>
+          <w:numId w:val="1"/>
+        </w:numPr>
+        <w:spacing w:after="6" w:line="230"/>
+      </w:pPr>
+      <w:r>
+        <w:rPr>
+          <w:rFonts w:ascii="Calibri" w:cs="Calibri" w:eastAsia="Calibri" w:hAnsi="Calibri"/>
+          <w:b/>
+          <w:bCs/>
+          <w:color w:val="333333"/>
+          <w:sz w:val="20"/>
+          <w:szCs w:val="20"/>
+        </w:rPr>
+        <w:t xml:space="preserve">ZeroVPN</w:t>
+      </w:r>
+      <w:r>
+        <w:rPr>
+          <w:rFonts w:ascii="Calibri" w:cs="Calibri" w:eastAsia="Calibri" w:hAnsi="Calibri"/>
+          <w:color w:val="333333"/>
+          <w:sz w:val="20"/>
+          <w:szCs w:val="20"/>
+        </w:rPr>
+        <w:t xml:space="preserve"> — self-hosted WireGuard VPN manager: a multi-crate Rust (Axum) backend and React frontend sharing one schema over WASM + MessagePack.</w:t>
+      </w:r>
+    </w:p>
+    <w:p>
+      <w:pPr>
+        <w:pStyle w:val="ListParagraph"/>
+        <w:numPr>
+          <w:ilvl w:val="0"/>
+          <w:numId w:val="1"/>
+        </w:numPr>
+        <w:spacing w:after="6" w:line="230"/>
+      </w:pPr>
+      <w:r>
+        <w:rPr>
+          <w:rFonts w:ascii="Calibri" w:cs="Calibri" w:eastAsia="Calibri" w:hAnsi="Calibri"/>
+          <w:b/>
+          <w:bCs/>
+          <w:color w:val="333333"/>
+          <w:sz w:val="20"/>
+          <w:szCs w:val="20"/>
+        </w:rPr>
+        <w:t xml:space="preserve">RAG Knowledge System</w:t>
+      </w:r>
+      <w:r>
+        <w:rPr>
+          <w:rFonts w:ascii="Calibri" w:cs="Calibri" w:eastAsia="Calibri" w:hAnsi="Calibri"/>
+          <w:color w:val="333333"/>
+          <w:sz w:val="20"/>
+          <w:szCs w:val="20"/>
+        </w:rPr>
+        <w:t xml:space="preserve"> — Retrieval-Augmented Generation with pgvector semantic search, LangGraph agent orchestration, and an LLM evaluation harness.</w:t>
+      </w:r>
+    </w:p>
+    <w:p>
+      <w:pPr>
+        <w:pStyle w:val="ListParagraph"/>
+        <w:numPr>
+          <w:ilvl w:val="0"/>
+          <w:numId w:val="1"/>
+        </w:numPr>
+        <w:spacing w:after="6" w:line="230"/>
+      </w:pPr>
+      <w:r>
+        <w:rPr>
+          <w:rFonts w:ascii="Calibri" w:cs="Calibri" w:eastAsia="Calibri" w:hAnsi="Calibri"/>
+          <w:b/>
+          <w:bCs/>
+          <w:color w:val="333333"/>
+          <w:sz w:val="20"/>
+          <w:szCs w:val="20"/>
+        </w:rPr>
+        <w:t xml:space="preserve">Docker Stats Monitor</w:t>
+      </w:r>
+      <w:r>
+        <w:rPr>
+          <w:rFonts w:ascii="Calibri" w:cs="Calibri" w:eastAsia="Calibri" w:hAnsi="Calibri"/>
+          <w:color w:val="333333"/>
+          <w:sz w:val="20"/>
+          <w:szCs w:val="20"/>
+        </w:rPr>
+        <w:t xml:space="preserve"> — real-time web dashboard streaming container status, CPU/memory usage, and network/block I/O over WebSockets.</w:t>
       </w:r>
     </w:p>
     <w:p>

</xml_diff>

<commit_message>
content(resume): uniform project bullets + fit to a single page
- fastapi-querybuilder is now an equal bold-named bullet (not a header), so
  no project reads as belonging to it; condensed its line
- Whole resume now fits on one sheet
</commit_message>
<xml_diff>
--- a/profile-assets/Bhadrinathan_A_Resume.docx
+++ b/profile-assets/Bhadrinathan_A_Resume.docx
@@ -691,76 +691,32 @@
     </w:p>
     <w:p>
       <w:pPr>
-        <w:tabs>
-          <w:tab w:val="right" w:pos="10440"/>
-        </w:tabs>
-        <w:spacing w:after="8" w:before="52"/>
-      </w:pPr>
-      <w:r>
-        <w:rPr>
-          <w:rFonts w:ascii="Calibri" w:cs="Calibri" w:eastAsia="Calibri" w:hAnsi="Calibri"/>
-          <w:b/>
-          <w:bCs/>
-          <w:color w:val="000000"/>
-          <w:sz w:val="21"/>
-          <w:szCs w:val="21"/>
-        </w:rPr>
-        <w:t xml:space="preserve">fastapi-querybuilder — Author &amp; Maintainer</w:t>
-      </w:r>
-      <w:r>
-        <w:rPr>
-          <w:rFonts w:ascii="Calibri" w:cs="Calibri" w:eastAsia="Calibri" w:hAnsi="Calibri"/>
-          <w:sz w:val="19"/>
-          <w:szCs w:val="19"/>
-        </w:rPr>
-        <w:tab/>
-      </w:r>
-      <w:r>
-        <w:rPr>
-          <w:rFonts w:ascii="Calibri" w:cs="Calibri" w:eastAsia="Calibri" w:hAnsi="Calibri"/>
-          <w:color w:val="555555"/>
-          <w:sz w:val="19"/>
-          <w:szCs w:val="19"/>
-        </w:rPr>
-        <w:t xml:space="preserve">Jun 2025 – Present</w:t>
-      </w:r>
-    </w:p>
-    <w:p>
-      <w:pPr>
-        <w:pStyle w:val="ListParagraph"/>
-        <w:numPr>
-          <w:ilvl w:val="0"/>
-          <w:numId w:val="1"/>
-        </w:numPr>
-        <w:spacing w:after="6" w:line="230"/>
-      </w:pPr>
-      <w:r>
-        <w:rPr>
-          <w:rFonts w:ascii="Calibri" w:cs="Calibri" w:eastAsia="Calibri" w:hAnsi="Calibri"/>
-          <w:color w:val="333333"/>
-          <w:sz w:val="20"/>
-          <w:szCs w:val="20"/>
-        </w:rPr>
-        <w:t xml:space="preserve">Python package adding smart filtering, sorting, and searching to FastAPI + SQLAlchemy apps — 16,000+ PyPI downloads, 18 releases, MIT license.</w:t>
-      </w:r>
-    </w:p>
-    <w:p>
-      <w:pPr>
-        <w:pStyle w:val="ListParagraph"/>
-        <w:numPr>
-          <w:ilvl w:val="0"/>
-          <w:numId w:val="1"/>
-        </w:numPr>
-        <w:spacing w:after="6" w:line="230"/>
-      </w:pPr>
-      <w:r>
-        <w:rPr>
-          <w:rFonts w:ascii="Calibri" w:cs="Calibri" w:eastAsia="Calibri" w:hAnsi="Calibri"/>
-          <w:color w:val="333333"/>
-          <w:sz w:val="20"/>
-          <w:szCs w:val="20"/>
-        </w:rPr>
-        <w:t xml:space="preserve">JSON-based filtering with 14 comparison and 2 logical operators, nested relationship queries with automatic joins, recursive global search, pagination, and soft-delete handling.</w:t>
+        <w:pStyle w:val="ListParagraph"/>
+        <w:numPr>
+          <w:ilvl w:val="0"/>
+          <w:numId w:val="1"/>
+        </w:numPr>
+        <w:spacing w:after="6" w:line="230"/>
+      </w:pPr>
+      <w:r>
+        <w:rPr>
+          <w:rFonts w:ascii="Calibri" w:cs="Calibri" w:eastAsia="Calibri" w:hAnsi="Calibri"/>
+          <w:b/>
+          <w:bCs/>
+          <w:color w:val="333333"/>
+          <w:sz w:val="20"/>
+          <w:szCs w:val="20"/>
+        </w:rPr>
+        <w:t xml:space="preserve">fastapi-querybuilder</w:t>
+      </w:r>
+      <w:r>
+        <w:rPr>
+          <w:rFonts w:ascii="Calibri" w:cs="Calibri" w:eastAsia="Calibri" w:hAnsi="Calibri"/>
+          <w:color w:val="333333"/>
+          <w:sz w:val="20"/>
+          <w:szCs w:val="20"/>
+        </w:rPr>
+        <w:t xml:space="preserve"> — authored Python package adding filtering, sorting, and search to FastAPI + SQLAlchemy (14 operators, nested relationship joins, pagination, soft-delete); 16,000+ PyPI downloads, MIT.</w:t>
       </w:r>
     </w:p>
     <w:p>

</xml_diff>

<commit_message>
Update resume source and PDF
</commit_message>
<xml_diff>
--- a/profile-assets/Bhadrinathan_A_Resume.docx
+++ b/profile-assets/Bhadrinathan_A_Resume.docx
@@ -32,7 +32,7 @@
           <w:sz w:val="22"/>
           <w:szCs w:val="22"/>
         </w:rPr>
-        <w:t xml:space="preserve">Software Engineer  |  Technical Lead</w:t>
+        <w:t xml:space="preserve">Backend Engineer  |  AI Systems  |  Technical Lead</w:t>
       </w:r>
     </w:p>
     <w:p>
@@ -55,6 +55,18 @@
         <w:spacing w:after="60"/>
         <w:jc w:val="center"/>
       </w:pPr>
+      <w:hyperlink r:id="rId106">
+        <w:r>
+          <w:rPr>
+            <w:rFonts w:ascii="Calibri" w:cs="Calibri" w:eastAsia="Calibri" w:hAnsi="Calibri"/>
+            <w:color w:val="0563C1"/>
+            <w:u w:val="single"/>
+            <w:sz w:val="18"/>
+            <w:szCs w:val="18"/>
+          </w:rPr>
+          <w:t xml:space="preserve">www.linkedin.com/in/bhadri01</w:t>
+        </w:r>
+      </w:hyperlink>
       <w:r>
         <w:rPr>
           <w:rFonts w:ascii="Calibri" w:cs="Calibri" w:eastAsia="Calibri" w:hAnsi="Calibri"/>
@@ -62,8 +74,41 @@
           <w:sz w:val="18"/>
           <w:szCs w:val="18"/>
         </w:rPr>
-        <w:t xml:space="preserve">www.linkedin.com/in/bhadri01  |  github.com/bhadri01  |  bha3.in</w:t>
-      </w:r>
+        <w:t xml:space="preserve">  |  </w:t>
+      </w:r>
+      <w:hyperlink r:id="rId107">
+        <w:r>
+          <w:rPr>
+            <w:rFonts w:ascii="Calibri" w:cs="Calibri" w:eastAsia="Calibri" w:hAnsi="Calibri"/>
+            <w:color w:val="0563C1"/>
+            <w:u w:val="single"/>
+            <w:sz w:val="18"/>
+            <w:szCs w:val="18"/>
+          </w:rPr>
+          <w:t xml:space="preserve">github.com/bhadri01</w:t>
+        </w:r>
+      </w:hyperlink>
+      <w:r>
+        <w:rPr>
+          <w:rFonts w:ascii="Calibri" w:cs="Calibri" w:eastAsia="Calibri" w:hAnsi="Calibri"/>
+          <w:color w:val="333333"/>
+          <w:sz w:val="18"/>
+          <w:szCs w:val="18"/>
+        </w:rPr>
+        <w:t xml:space="preserve">  |  </w:t>
+      </w:r>
+      <w:hyperlink r:id="rId108">
+        <w:r>
+          <w:rPr>
+            <w:rFonts w:ascii="Calibri" w:cs="Calibri" w:eastAsia="Calibri" w:hAnsi="Calibri"/>
+            <w:color w:val="0563C1"/>
+            <w:u w:val="single"/>
+            <w:sz w:val="18"/>
+            <w:szCs w:val="18"/>
+          </w:rPr>
+          <w:t xml:space="preserve">bha3.in</w:t>
+        </w:r>
+      </w:hyperlink>
     </w:p>
     <w:p>
       <w:pPr>
@@ -97,7 +142,7 @@
           <w:sz w:val="20"/>
           <w:szCs w:val="20"/>
         </w:rPr>
-        <w:t xml:space="preserve">Software engineer with 4 years of experience shipping full-stack products end to end — from a police records CRM to cloud lab infrastructure and an edtech marketplace, and most recently production Retrieval-Augmented Generation (RAG) and agentic AI systems. Author of fastapi-querybuilder, an open-source Python package with 16,000+ PyPI downloads. Progressed from Software Developer to Technical Lead at BloomSkillTech, owning architecture, engineering processes, and delivery.</w:t>
+        <w:t xml:space="preserve">Backend engineer with 4 years building production Python systems — FastAPI, PostgreSQL, Redis, Docker — currently Technical Lead on an edtech marketplace at BloomSkillTech. Author of fastapi-querybuilder, an open-source package with 16,000+ PyPI downloads across 18 releases. Currently working in AI engineering: retrieval pipelines over pgvector, agent orchestration with LangGraph, and MCP servers that expose real tools to LLM clients.</w:t>
       </w:r>
     </w:p>
     <w:p>
@@ -138,16 +183,16 @@
           <w:sz w:val="20"/>
           <w:szCs w:val="20"/>
         </w:rPr>
-        <w:t xml:space="preserve">Languages: </w:t>
-      </w:r>
-      <w:r>
-        <w:rPr>
-          <w:rFonts w:ascii="Calibri" w:cs="Calibri" w:eastAsia="Calibri" w:hAnsi="Calibri"/>
-          <w:color w:val="333333"/>
-          <w:sz w:val="20"/>
-          <w:szCs w:val="20"/>
-        </w:rPr>
-        <w:t xml:space="preserve">Python, TypeScript, JavaScript, Go, SQL, Rust (basic)</w:t>
+        <w:t xml:space="preserve">Core: </w:t>
+      </w:r>
+      <w:r>
+        <w:rPr>
+          <w:rFonts w:ascii="Calibri" w:cs="Calibri" w:eastAsia="Calibri" w:hAnsi="Calibri"/>
+          <w:color w:val="333333"/>
+          <w:sz w:val="20"/>
+          <w:szCs w:val="20"/>
+        </w:rPr>
+        <w:t xml:space="preserve">Python, FastAPI, PostgreSQL, SQLAlchemy, Redis, Docker, REST &amp; SSE APIs, Linux</w:t>
       </w:r>
     </w:p>
     <w:p>
@@ -168,16 +213,16 @@
           <w:sz w:val="20"/>
           <w:szCs w:val="20"/>
         </w:rPr>
-        <w:t xml:space="preserve">Backend: </w:t>
-      </w:r>
-      <w:r>
-        <w:rPr>
-          <w:rFonts w:ascii="Calibri" w:cs="Calibri" w:eastAsia="Calibri" w:hAnsi="Calibri"/>
-          <w:color w:val="333333"/>
-          <w:sz w:val="20"/>
-          <w:szCs w:val="20"/>
-        </w:rPr>
-        <w:t xml:space="preserve">FastAPI, REST APIs, SQLAlchemy, Server-Sent Events, PostgreSQL, Redis</w:t>
+        <w:t xml:space="preserve">AI Engineering: </w:t>
+      </w:r>
+      <w:r>
+        <w:rPr>
+          <w:rFonts w:ascii="Calibri" w:cs="Calibri" w:eastAsia="Calibri" w:hAnsi="Calibri"/>
+          <w:color w:val="333333"/>
+          <w:sz w:val="20"/>
+          <w:szCs w:val="20"/>
+        </w:rPr>
+        <w:t xml:space="preserve">RAG (pgvector), LangChain, LangGraph, MCP servers, OpenAI API</w:t>
       </w:r>
     </w:p>
     <w:p>
@@ -198,16 +243,16 @@
           <w:sz w:val="20"/>
           <w:szCs w:val="20"/>
         </w:rPr>
-        <w:t xml:space="preserve">AI / LLM: </w:t>
-      </w:r>
-      <w:r>
-        <w:rPr>
-          <w:rFonts w:ascii="Calibri" w:cs="Calibri" w:eastAsia="Calibri" w:hAnsi="Calibri"/>
-          <w:color w:val="333333"/>
-          <w:sz w:val="20"/>
-          <w:szCs w:val="20"/>
-        </w:rPr>
-        <w:t xml:space="preserve">Retrieval-Augmented Generation (RAG), LangChain, LangGraph, pgvector, LLM evaluation, AI agents</w:t>
+        <w:t xml:space="preserve">Also ship with: </w:t>
+      </w:r>
+      <w:r>
+        <w:rPr>
+          <w:rFonts w:ascii="Calibri" w:cs="Calibri" w:eastAsia="Calibri" w:hAnsi="Calibri"/>
+          <w:color w:val="333333"/>
+          <w:sz w:val="20"/>
+          <w:szCs w:val="20"/>
+        </w:rPr>
+        <w:t xml:space="preserve">TypeScript, React, Rust, Celery, GitHub Actions, Nginx/Traefik, Pytest</w:t>
       </w:r>
     </w:p>
     <w:p>
@@ -228,66 +273,6 @@
           <w:sz w:val="20"/>
           <w:szCs w:val="20"/>
         </w:rPr>
-        <w:t xml:space="preserve">Frontend: </w:t>
-      </w:r>
-      <w:r>
-        <w:rPr>
-          <w:rFonts w:ascii="Calibri" w:cs="Calibri" w:eastAsia="Calibri" w:hAnsi="Calibri"/>
-          <w:color w:val="333333"/>
-          <w:sz w:val="20"/>
-          <w:szCs w:val="20"/>
-        </w:rPr>
-        <w:t xml:space="preserve">React, Next.js, Tailwind CSS</w:t>
-      </w:r>
-    </w:p>
-    <w:p>
-      <w:pPr>
-        <w:pStyle w:val="ListParagraph"/>
-        <w:numPr>
-          <w:ilvl w:val="0"/>
-          <w:numId w:val="1"/>
-        </w:numPr>
-        <w:spacing w:after="40"/>
-      </w:pPr>
-      <w:r>
-        <w:rPr>
-          <w:rFonts w:ascii="Calibri" w:cs="Calibri" w:eastAsia="Calibri" w:hAnsi="Calibri"/>
-          <w:b/>
-          <w:bCs/>
-          <w:color w:val="000000"/>
-          <w:sz w:val="20"/>
-          <w:szCs w:val="20"/>
-        </w:rPr>
-        <w:t xml:space="preserve">Infrastructure &amp; DevOps: </w:t>
-      </w:r>
-      <w:r>
-        <w:rPr>
-          <w:rFonts w:ascii="Calibri" w:cs="Calibri" w:eastAsia="Calibri" w:hAnsi="Calibri"/>
-          <w:color w:val="333333"/>
-          <w:sz w:val="20"/>
-          <w:szCs w:val="20"/>
-        </w:rPr>
-        <w:t xml:space="preserve">Docker, Linux, GitHub Actions (CI/CD), Nginx, WireGuard VPN, container orchestration</w:t>
-      </w:r>
-    </w:p>
-    <w:p>
-      <w:pPr>
-        <w:pStyle w:val="ListParagraph"/>
-        <w:numPr>
-          <w:ilvl w:val="0"/>
-          <w:numId w:val="1"/>
-        </w:numPr>
-        <w:spacing w:after="40"/>
-      </w:pPr>
-      <w:r>
-        <w:rPr>
-          <w:rFonts w:ascii="Calibri" w:cs="Calibri" w:eastAsia="Calibri" w:hAnsi="Calibri"/>
-          <w:b/>
-          <w:bCs/>
-          <w:color w:val="000000"/>
-          <w:sz w:val="20"/>
-          <w:szCs w:val="20"/>
-        </w:rPr>
         <w:t xml:space="preserve">Practices: </w:t>
       </w:r>
       <w:r>
@@ -297,7 +282,7 @@
           <w:sz w:val="20"/>
           <w:szCs w:val="20"/>
         </w:rPr>
-        <w:t xml:space="preserve">System design (HLD/LLD), code review, automated testing, phased delivery, agentic AI coding tools</w:t>
+        <w:t xml:space="preserve">System design (HLD/LLD), code review, automated testing, CI/CD, phased delivery</w:t>
       </w:r>
     </w:p>
     <w:p>
@@ -426,7 +411,7 @@
           <w:sz w:val="20"/>
           <w:szCs w:val="20"/>
         </w:rPr>
-        <w:t xml:space="preserve">Established team engineering processes: CI/CD pipelines, automated testing, code reviews, and phased delivery.</w:t>
+        <w:t xml:space="preserve">Established team engineering process: CI/CD pipelines, automated testing, code review, and phased delivery.</w:t>
       </w:r>
     </w:p>
     <w:p>
@@ -519,64 +504,26 @@
           <w:sz w:val="20"/>
           <w:szCs w:val="20"/>
         </w:rPr>
-        <w:t xml:space="preserve">Developed the core full-stack product: user-facing frontend, backend APIs, and environment provisioning services, with containerized labs for consistent, reproducible sessions.</w:t>
-      </w:r>
-    </w:p>
-    <w:p>
-      <w:pPr>
-        <w:pStyle w:val="ListParagraph"/>
-        <w:numPr>
-          <w:ilvl w:val="0"/>
-          <w:numId w:val="1"/>
-        </w:numPr>
-        <w:spacing w:after="6" w:line="230"/>
-      </w:pPr>
-      <w:r>
-        <w:rPr>
-          <w:rFonts w:ascii="Calibri" w:cs="Calibri" w:eastAsia="Calibri" w:hAnsi="Calibri"/>
-          <w:color w:val="333333"/>
-          <w:sz w:val="20"/>
-          <w:szCs w:val="20"/>
-        </w:rPr>
-        <w:t xml:space="preserve">Designed and implemented a secure WireGuard VPN layer for private, per-session network access to lab environments, with controlled resource access and isolation.</w:t>
-      </w:r>
-    </w:p>
-    <w:p>
-      <w:pPr>
-        <w:pStyle w:val="ListParagraph"/>
-        <w:numPr>
-          <w:ilvl w:val="0"/>
-          <w:numId w:val="1"/>
-        </w:numPr>
-        <w:spacing w:after="6" w:line="230"/>
-      </w:pPr>
-      <w:r>
-        <w:rPr>
-          <w:rFonts w:ascii="Calibri" w:cs="Calibri" w:eastAsia="Calibri" w:hAnsi="Calibri"/>
-          <w:color w:val="333333"/>
-          <w:sz w:val="20"/>
-          <w:szCs w:val="20"/>
-        </w:rPr>
-        <w:t xml:space="preserve">Built the orchestration layer to automatically provision, scale, and tear down containerized environments, optimizing cloud resource usage and cost.</w:t>
-      </w:r>
-    </w:p>
-    <w:p>
-      <w:pPr>
-        <w:pStyle w:val="ListParagraph"/>
-        <w:numPr>
-          <w:ilvl w:val="0"/>
-          <w:numId w:val="1"/>
-        </w:numPr>
-        <w:spacing w:after="6" w:line="230"/>
-      </w:pPr>
-      <w:r>
-        <w:rPr>
-          <w:rFonts w:ascii="Calibri" w:cs="Calibri" w:eastAsia="Calibri" w:hAnsi="Calibri"/>
-          <w:color w:val="333333"/>
-          <w:sz w:val="20"/>
-          <w:szCs w:val="20"/>
-        </w:rPr>
-        <w:t xml:space="preserve">Drove code quality and architectural direction through reviews and guidance across the platform.</w:t>
+        <w:t xml:space="preserve">Designed and implemented a secure WireGuard VPN layer giving each session private, isolated network access to its lab environment.</w:t>
+      </w:r>
+    </w:p>
+    <w:p>
+      <w:pPr>
+        <w:pStyle w:val="ListParagraph"/>
+        <w:numPr>
+          <w:ilvl w:val="0"/>
+          <w:numId w:val="1"/>
+        </w:numPr>
+        <w:spacing w:after="6" w:line="230"/>
+      </w:pPr>
+      <w:r>
+        <w:rPr>
+          <w:rFonts w:ascii="Calibri" w:cs="Calibri" w:eastAsia="Calibri" w:hAnsi="Calibri"/>
+          <w:color w:val="333333"/>
+          <w:sz w:val="20"/>
+          <w:szCs w:val="20"/>
+        </w:rPr>
+        <w:t xml:space="preserve">Built the orchestration layer that provisions, scales, and tears down containerized environments automatically, cutting idle cloud spend.</w:t>
       </w:r>
     </w:p>
     <w:p>
@@ -698,145 +645,155 @@
         </w:numPr>
         <w:spacing w:after="6" w:line="230"/>
       </w:pPr>
-      <w:r>
-        <w:rPr>
-          <w:rFonts w:ascii="Calibri" w:cs="Calibri" w:eastAsia="Calibri" w:hAnsi="Calibri"/>
-          <w:b/>
-          <w:bCs/>
-          <w:color w:val="333333"/>
-          <w:sz w:val="20"/>
-          <w:szCs w:val="20"/>
-        </w:rPr>
-        <w:t xml:space="preserve">fastapi-querybuilder</w:t>
-      </w:r>
-      <w:r>
-        <w:rPr>
-          <w:rFonts w:ascii="Calibri" w:cs="Calibri" w:eastAsia="Calibri" w:hAnsi="Calibri"/>
-          <w:color w:val="333333"/>
-          <w:sz w:val="20"/>
-          <w:szCs w:val="20"/>
-        </w:rPr>
-        <w:t xml:space="preserve"> — authored Python package adding filtering, sorting, and search to FastAPI + SQLAlchemy (14 operators, nested relationship joins, pagination, soft-delete); 16,000+ PyPI downloads, MIT.</w:t>
-      </w:r>
-    </w:p>
-    <w:p>
-      <w:pPr>
-        <w:pStyle w:val="ListParagraph"/>
-        <w:numPr>
-          <w:ilvl w:val="0"/>
-          <w:numId w:val="1"/>
-        </w:numPr>
-        <w:spacing w:after="6" w:line="230"/>
-      </w:pPr>
-      <w:r>
-        <w:rPr>
-          <w:rFonts w:ascii="Calibri" w:cs="Calibri" w:eastAsia="Calibri" w:hAnsi="Calibri"/>
-          <w:b/>
-          <w:bCs/>
-          <w:color w:val="333333"/>
-          <w:sz w:val="20"/>
-          <w:szCs w:val="20"/>
-        </w:rPr>
-        <w:t xml:space="preserve">fastapi_sse_events</w:t>
-      </w:r>
-      <w:r>
-        <w:rPr>
-          <w:rFonts w:ascii="Calibri" w:cs="Calibri" w:eastAsia="Calibri" w:hAnsi="Calibri"/>
-          <w:color w:val="333333"/>
-          <w:sz w:val="20"/>
-          <w:szCs w:val="20"/>
-        </w:rPr>
-        <w:t xml:space="preserve"> — published PyPI library that simplifies Server-Sent Events for FastAPI, backed by Redis pub/sub for horizontal scale.</w:t>
-      </w:r>
-    </w:p>
-    <w:p>
-      <w:pPr>
-        <w:pStyle w:val="ListParagraph"/>
-        <w:numPr>
-          <w:ilvl w:val="0"/>
-          <w:numId w:val="1"/>
-        </w:numPr>
-        <w:spacing w:after="6" w:line="230"/>
-      </w:pPr>
-      <w:r>
-        <w:rPr>
-          <w:rFonts w:ascii="Calibri" w:cs="Calibri" w:eastAsia="Calibri" w:hAnsi="Calibri"/>
-          <w:b/>
-          <w:bCs/>
-          <w:color w:val="333333"/>
-          <w:sz w:val="20"/>
-          <w:szCs w:val="20"/>
-        </w:rPr>
-        <w:t xml:space="preserve">ZeroVPN</w:t>
-      </w:r>
-      <w:r>
-        <w:rPr>
-          <w:rFonts w:ascii="Calibri" w:cs="Calibri" w:eastAsia="Calibri" w:hAnsi="Calibri"/>
-          <w:color w:val="333333"/>
-          <w:sz w:val="20"/>
-          <w:szCs w:val="20"/>
-        </w:rPr>
-        <w:t xml:space="preserve"> — self-hosted WireGuard VPN manager: a multi-crate Rust (Axum) backend and React frontend sharing one schema over WASM + MessagePack.</w:t>
-      </w:r>
-    </w:p>
-    <w:p>
-      <w:pPr>
-        <w:pStyle w:val="ListParagraph"/>
-        <w:numPr>
-          <w:ilvl w:val="0"/>
-          <w:numId w:val="1"/>
-        </w:numPr>
-        <w:spacing w:after="6" w:line="230"/>
-      </w:pPr>
-      <w:r>
-        <w:rPr>
-          <w:rFonts w:ascii="Calibri" w:cs="Calibri" w:eastAsia="Calibri" w:hAnsi="Calibri"/>
-          <w:b/>
-          <w:bCs/>
-          <w:color w:val="333333"/>
-          <w:sz w:val="20"/>
-          <w:szCs w:val="20"/>
-        </w:rPr>
-        <w:t xml:space="preserve">RAG Knowledge System</w:t>
-      </w:r>
-      <w:r>
-        <w:rPr>
-          <w:rFonts w:ascii="Calibri" w:cs="Calibri" w:eastAsia="Calibri" w:hAnsi="Calibri"/>
-          <w:color w:val="333333"/>
-          <w:sz w:val="20"/>
-          <w:szCs w:val="20"/>
-        </w:rPr>
-        <w:t xml:space="preserve"> — Retrieval-Augmented Generation with pgvector semantic search, LangGraph agent orchestration, and an LLM evaluation harness.</w:t>
-      </w:r>
-    </w:p>
-    <w:p>
-      <w:pPr>
-        <w:pStyle w:val="ListParagraph"/>
-        <w:numPr>
-          <w:ilvl w:val="0"/>
-          <w:numId w:val="1"/>
-        </w:numPr>
-        <w:spacing w:after="6" w:line="230"/>
-      </w:pPr>
-      <w:r>
-        <w:rPr>
-          <w:rFonts w:ascii="Calibri" w:cs="Calibri" w:eastAsia="Calibri" w:hAnsi="Calibri"/>
-          <w:b/>
-          <w:bCs/>
-          <w:color w:val="333333"/>
-          <w:sz w:val="20"/>
-          <w:szCs w:val="20"/>
-        </w:rPr>
-        <w:t xml:space="preserve">Docker Stats Monitor</w:t>
-      </w:r>
-      <w:r>
-        <w:rPr>
-          <w:rFonts w:ascii="Calibri" w:cs="Calibri" w:eastAsia="Calibri" w:hAnsi="Calibri"/>
-          <w:color w:val="333333"/>
-          <w:sz w:val="20"/>
-          <w:szCs w:val="20"/>
-        </w:rPr>
-        <w:t xml:space="preserve"> — real-time web dashboard streaming container status, CPU/memory usage, and network/block I/O over WebSockets.</w:t>
+      <w:hyperlink r:id="rId101">
+        <w:r>
+          <w:rPr>
+            <w:rFonts w:ascii="Calibri" w:cs="Calibri" w:eastAsia="Calibri" w:hAnsi="Calibri"/>
+            <w:b/>
+            <w:bCs/>
+            <w:color w:val="0563C1"/>
+            <w:sz w:val="20"/>
+            <w:szCs w:val="20"/>
+          </w:rPr>
+          <w:t xml:space="preserve">fastapi-querybuilder</w:t>
+        </w:r>
+      </w:hyperlink>
+      <w:r>
+        <w:rPr>
+          <w:rFonts w:ascii="Calibri" w:cs="Calibri" w:eastAsia="Calibri" w:hAnsi="Calibri"/>
+          <w:color w:val="333333"/>
+          <w:sz w:val="20"/>
+          <w:szCs w:val="20"/>
+        </w:rPr>
+        <w:t xml:space="preserve"> — filtering, sorting and search for FastAPI + SQLAlchemy: 14 operators, nested relationship joins, pagination, soft-delete — generated into SQLAlchemy, never string-built. 16,000+ PyPI downloads across 18 releases, MIT.</w:t>
+      </w:r>
+    </w:p>
+    <w:p>
+      <w:pPr>
+        <w:pStyle w:val="ListParagraph"/>
+        <w:numPr>
+          <w:ilvl w:val="0"/>
+          <w:numId w:val="1"/>
+        </w:numPr>
+        <w:spacing w:after="6" w:line="230"/>
+      </w:pPr>
+      <w:hyperlink r:id="rId102">
+        <w:r>
+          <w:rPr>
+            <w:rFonts w:ascii="Calibri" w:cs="Calibri" w:eastAsia="Calibri" w:hAnsi="Calibri"/>
+            <w:b/>
+            <w:bCs/>
+            <w:color w:val="0563C1"/>
+            <w:sz w:val="20"/>
+            <w:szCs w:val="20"/>
+          </w:rPr>
+          <w:t xml:space="preserve">ZeroCode</w:t>
+        </w:r>
+      </w:hyperlink>
+      <w:r>
+        <w:rPr>
+          <w:rFonts w:ascii="Calibri" w:cs="Calibri" w:eastAsia="Calibri" w:hAnsi="Calibri"/>
+          <w:color w:val="333333"/>
+          <w:sz w:val="20"/>
+          <w:szCs w:val="20"/>
+        </w:rPr>
+        <w:t xml:space="preserve"> — sandboxed execution of untrusted code across 20 languages behind 8 independent isolation layers (namespaces, pivot_root, cgroup v2, Landlock, seccomp BPF, full capability drop); hardened against 130+ adversarial tests. 7-crate Rust/Axum workspace.</w:t>
+      </w:r>
+    </w:p>
+    <w:p>
+      <w:pPr>
+        <w:pStyle w:val="ListParagraph"/>
+        <w:numPr>
+          <w:ilvl w:val="0"/>
+          <w:numId w:val="1"/>
+        </w:numPr>
+        <w:spacing w:after="6" w:line="230"/>
+      </w:pPr>
+      <w:hyperlink r:id="rId103">
+        <w:r>
+          <w:rPr>
+            <w:rFonts w:ascii="Calibri" w:cs="Calibri" w:eastAsia="Calibri" w:hAnsi="Calibri"/>
+            <w:b/>
+            <w:bCs/>
+            <w:color w:val="0563C1"/>
+            <w:sz w:val="20"/>
+            <w:szCs w:val="20"/>
+          </w:rPr>
+          <w:t xml:space="preserve">fastapi_sse_events</w:t>
+        </w:r>
+      </w:hyperlink>
+      <w:r>
+        <w:rPr>
+          <w:rFonts w:ascii="Calibri" w:cs="Calibri" w:eastAsia="Calibri" w:hAnsi="Calibri"/>
+          <w:color w:val="333333"/>
+          <w:sz w:val="20"/>
+          <w:szCs w:val="20"/>
+        </w:rPr>
+        <w:t xml:space="preserve"> — published PyPI library for Server-Sent Events in FastAPI, backed by Redis pub/sub so streams survive more than one server.</w:t>
+      </w:r>
+    </w:p>
+    <w:p>
+      <w:pPr>
+        <w:pStyle w:val="ListParagraph"/>
+        <w:numPr>
+          <w:ilvl w:val="0"/>
+          <w:numId w:val="1"/>
+        </w:numPr>
+        <w:spacing w:after="6" w:line="230"/>
+      </w:pPr>
+      <w:hyperlink r:id="rId104">
+        <w:r>
+          <w:rPr>
+            <w:rFonts w:ascii="Calibri" w:cs="Calibri" w:eastAsia="Calibri" w:hAnsi="Calibri"/>
+            <w:b/>
+            <w:bCs/>
+            <w:color w:val="0563C1"/>
+            <w:sz w:val="20"/>
+            <w:szCs w:val="20"/>
+          </w:rPr>
+          <w:t xml:space="preserve">ZeroVPN</w:t>
+        </w:r>
+      </w:hyperlink>
+      <w:r>
+        <w:rPr>
+          <w:rFonts w:ascii="Calibri" w:cs="Calibri" w:eastAsia="Calibri" w:hAnsi="Calibri"/>
+          <w:color w:val="333333"/>
+          <w:sz w:val="20"/>
+          <w:szCs w:val="20"/>
+        </w:rPr>
+        <w:t xml:space="preserve"> — self-hosted WireGuard manager: a Rust (Axum) backend and React frontend sharing one wire schema by compiling a Rust crate to WASM and speaking MessagePack.</w:t>
+      </w:r>
+    </w:p>
+    <w:p>
+      <w:pPr>
+        <w:pStyle w:val="ListParagraph"/>
+        <w:numPr>
+          <w:ilvl w:val="0"/>
+          <w:numId w:val="1"/>
+        </w:numPr>
+        <w:spacing w:after="6" w:line="230"/>
+      </w:pPr>
+      <w:hyperlink r:id="rId105">
+        <w:r>
+          <w:rPr>
+            <w:rFonts w:ascii="Calibri" w:cs="Calibri" w:eastAsia="Calibri" w:hAnsi="Calibri"/>
+            <w:b/>
+            <w:bCs/>
+            <w:color w:val="0563C1"/>
+            <w:sz w:val="20"/>
+            <w:szCs w:val="20"/>
+          </w:rPr>
+          <w:t xml:space="preserve">NullVeil</w:t>
+        </w:r>
+      </w:hyperlink>
+      <w:r>
+        <w:rPr>
+          <w:rFonts w:ascii="Calibri" w:cs="Calibri" w:eastAsia="Calibri" w:hAnsi="Calibri"/>
+          <w:color w:val="333333"/>
+          <w:sz w:val="20"/>
+          <w:szCs w:val="20"/>
+        </w:rPr>
+        <w:t xml:space="preserve"> — read-only forensics tooling in Rust: filesystem parsers that physically cannot write to the disk they read.</w:t>
       </w:r>
     </w:p>
     <w:p>

</xml_diff>

<commit_message>
Re-export résumé from source and align public copy with verified numbers
- Résumé PDF re-exported from the .docx via LibreOffice so the phone number and
  summary sit in reading order in the text layer and the header LinkedIn/GitHub
  links are back; PDF title/author metadata set.
- Summary now reads "4 years of professional experience, 3+ of them building
  production Python systems"; fastapi-querybuilder stated as 18,000+ downloads
  and 15 tagged releases (what PyPI/pepy and GitHub actually show).
- Site: About card title Backend Engineer · Technical Lead, 18K+/18,000+
  download figures, education title carries the branch, SSE Events dated 2026,
  unsupported "75%" line and dead algo.bha3.in hostname removed, operator count
  matches the README.
- Static no-JS résumé link now uses the versioned URL; version bumped so the
  new PDF bypasses the CDN cache.

Co-Authored-By: Claude Fable 5.1 <noreply@anthropic.com>
Claude-Session: https://claude.ai/code/session_01TRmWBcMPjin2BfCdiomyAd
</commit_message>
<xml_diff>
--- a/profile-assets/Bhadrinathan_A_Resume.docx
+++ b/profile-assets/Bhadrinathan_A_Resume.docx
@@ -142,7 +142,7 @@
           <w:sz w:val="20"/>
           <w:szCs w:val="20"/>
         </w:rPr>
-        <w:t xml:space="preserve">Backend engineer with 4+ years of experience building production Python systems — FastAPI, PostgreSQL, Redis, Docker — currently Technical Lead on an edtech marketplace at BloomSkillTech. Author of fastapi-querybuilder, an open-source package with 16,000+ PyPI downloads across 18 releases. Currently working in AI engineering: retrieval pipelines over pgvector, agent orchestration with LangGraph, and MCP servers that expose real tools to LLM clients.</w:t>
+        <w:t>Backend engineer with 4 years of professional experience, 3+ of them building production Python systems — FastAPI, PostgreSQL, Redis, Docker — currently Technical Lead on an edtech marketplace at BloomSkillTech. Author of fastapi-querybuilder, an open-source package with 18,000+ PyPI downloads. Currently working in AI engineering: retrieval pipelines over pgvector, agent orchestration with LangGraph, and MCP servers that expose real tools to LLM clients.</w:t>
       </w:r>
     </w:p>
     <w:p>
@@ -665,7 +665,7 @@
           <w:sz w:val="20"/>
           <w:szCs w:val="20"/>
         </w:rPr>
-        <w:t xml:space="preserve"> — filtering, sorting and search for FastAPI + SQLAlchemy: 14 operators, nested relationship joins, pagination, soft-delete — generated into SQLAlchemy, never string-built. 16,000+ PyPI downloads across 18 releases, MIT.</w:t>
+        <w:t xml:space="preserve"> — filtering, sorting and search for FastAPI + SQLAlchemy: 14 operators, nested relationship joins, pagination, soft-delete — generated into SQLAlchemy, never string-built. 18,000+ PyPI downloads, 15 tagged releases, MIT.</w:t>
       </w:r>
     </w:p>
     <w:p>

</xml_diff>